<commit_message>
docs: handoff PR #435-438 (rappel d'échéance popup, courses Fait/partiel)
Rattrapage documentaire couvrant les quatre PR mergées de ce cycle :
- PR #435 : popup de rappel d'échéance du jour (repas/affaires/administratif/autre)
  + correctif du filtre semaine de la tuile « Mes engagements »
- PR #436 : texte du popup affiné, « Modifier le besoin » ouvert à tout auteur,
  cochage automatique au claim courses réintroduit, liste rouverte après ajout
  d'article sur une liste « Fait »
- PR #437 : popup simplifié + reproposé à chaque reconnexion, alerte d'échéance
  étendue aux courses, ShoppingListModal regroupé par contributeur + resynchronisé
- PR #438 : bouton « ✓ Fait » (popup + mur) et badge « Pris en charge / partiellement »

Documentation/Documentation Fonctionnalités.docx : V1.35 → V1.36
PRD_AvecToi_v1_4.md : v1.34 → v1.35

Co-Authored-By: Claude Sonnet 5 <noreply@anthropic.com>
Claude-Session: https://claude.ai/code/session_01E5eMfnsVmAhe7Rz4TFNVm1
</commit_message>
<xml_diff>
--- a/Documentation/Documentation Fonctionnalités.docx
+++ b/Documentation/Documentation Fonctionnalités.docx
@@ -280,7 +280,7 @@
                 <w:color w:val="A0C4E8"/>
                 <w:sz w:val="17"/>
               </w:rPr>
-              <w:t>12/09/2026 — V1.35</w:t>
+              <w:t>13/09/2026 — V1.36</w:t>
             </w:r>
           </w:p>
         </w:tc>
@@ -8155,6 +8155,15 @@
               </w:rPr>
               <w:t xml:space="preserve"> Depuis le 31/08/2026 (PR #350), au sein de la section des besoins ouverts, ceux encore marqués « New » (voir « Indicateur New… » en 4. Fonctionnalités transverses) remontent groupés en tête de liste, chaque groupe conservant son tri habituel (Urgent d'abord, puis chronologique) ; un besoin retombe naturellement dans l'ordre normal dès qu'il n'est plus New, sans action manuelle. Depuis le 01/09/2026 (PR #355), le tag Urgent (cadre rouge) se déclenche désormais aussi automatiquement, sans action de l'utilisateur, dès qu'un besoin ouvert entre dans sa fenêtre d'échéance à J+3 ou moins — quelle que soit son ancienneté de publication et sans avoir été coché Urgent à la création ; corrigé le 01/09/2026 (PR #356) pour que ce déclenchement automatique reste actif même une fois l'échéance elle-même dépassée, tant que le besoin n'est pas pris en charge (seule la prise en charge y met fin — en pratique la fermeture automatique déjà en place clôt le besoin environ 60 secondes après l'échéance, ce qui limite cette persistance à une fenêtre très courte). Depuis le 01/09/2026 (PR #352), le bouton « J'ai compris » du popup de remerciement ramène désormais vers le besoin lui-même (scroll + surlignage), au lieu de la liste des besoins — sauf pour un besoin de relais ponctuel, qui continue de ramener vers l'accueil (voir « Besoin de relais ponctuel » ci-dessous). Depuis le 10/09/2026 (PR #427), un popup d'alerte à la connexion — même architecture que celui du besoin de relais ponctuel ci-dessous — s'affiche pour l'auteur du besoin ou la personne à transporter dès qu'une proposition d'horaire de transport n'a pas encore été vue (bouton « Voir les propositions » ouvrant directement Entraide sur ce besoin et marquant la ou les propositions vues, bouton « Plus tard » masquant le popup pour la session en cours uniquement, sans marquage automatique à la simple fermeture) ; le mur affiche aussi un badge « New » sur la carte tant qu'une proposition attachée n'a pas été vue par ce chemin. Depuis le 12/09/2026 (PR #429), un besoin Transport validé (aller, retour, ou les deux) passe automatiquement en statut « fermé » au lieu de « pris en charge » ; ses propositions restent consultables (badge « ✅ Validée (aller)/(retour)/(aller + retour) » par proposition, nouveau bouton « 🕐 Propositions (N) » en lecture seule, « 📅 Ajouter au calendrier » toujours disponible), seuls « C'est fait »/« Se désinscrire » restant réservés au statut pris en charge ; correctif du 12/09/2026 (PR #430) : l'alerte popup de proposition non vue (voir « Alerte proposition de transport » en 5.18/6.5) ne se déclenche plus que pour un besoin encore « ouvert », après une régression où elle revenait indéfiniment sur un besoin déjà fermé. Depuis le 12/09/2026 (PR #431-433), le pictogramme générique « 👤 » devant le nom de la personne en charge est remplacé, sur la carte du besoin, par sa vraie photo (ou, à défaut, un avatar aux initiales prénom + nom, ex. « JD » — corrigé PR #433, qui ne reprenait auparavant que l'initiale du prénom) — pour un besoin de relais, une vignette par jour couvert ; « 👤 Demandé par… » (auteur) et le toggle « 👤 Pour une autre personne » restent inchangés.</w:t>
             </w:r>
+            <w:r>
+              <w:rPr>
+                <w:rFonts w:ascii="Arial" w:hAnsi="Arial"/>
+                <w:b w:val="0"/>
+                <w:i w:val="0"/>
+                <w:sz w:val="18"/>
+              </w:rPr>
+              <w:t xml:space="preserve"> Depuis le 12/09/2026 (PR #435), un popup de rappel s'affiche à la connexion (et à chaque retour au premier plan) pour chaque besoin Repas/Affaires/Administratif/Autre pris en charge par l'utilisateur connecté dont l'échéance tombe le jour même — bouton « C'est fait » ouvrant directement la sheet de confirmation existante (PIN + photo optionnelle) via le même mécanisme que l'alerte de relais, bouton « Fermer » passant à l'alerte suivante ou ramenant vers « Ma semaine » ; le popup revient à chaque reconnexion tant que le besoin n'est pas marqué fait (texte affiné PR #436 puis simplifié PR #437, titre seul). Depuis le 12/09/2026 (PR #436), le bouton « ✏️ Modifier le besoin » (et son raccourci par appui long) est désormais visible pour l'auteur de n'importe quel besoin, visiteur inclus, et pas seulement l'admin sur ses propres besoins — permet de corriger une échéance oubliée à la publication directement depuis le mur.</w:t>
+            </w:r>
           </w:p>
         </w:tc>
       </w:tr>
@@ -8308,6 +8317,15 @@
                 <w:sz w:val="18"/>
               </w:rPr>
               <w:t>Catégorie Courses : liste d'articles ajoutés un par un à la création (pas de description libre), modifiable à tout moment par n'importe quel visiteur ou admin via « 👁️ Aperçu de la liste ». Tant que personne n'a cliqué « Je m'en occupe » sur le besoin, tous les articles restent cochables par n'importe qui pour dispatcher les courses entre plusieurs personnes ; un article déjà coché ne peut toutefois être décoché que par la personne qui l'a coché elle-même, jamais par une autre. Chaque article coché affiche l'identité de qui l'a coché (« par Prénom Nom »). Le bloc du besoin résume en direct qui s'en occupe, en cumulant toutes les identités ayant coché au moins un article : « X s'en occupe » (une personne), « X, Y et Z s'en occupent » (plusieurs), avec la mention « … partiellement » tant que la liste n'est pas intégralement cochée. Dès qu'une personne clique « Je m'en occupe » sur le besoin, elle devient seule habilitée à cocher/décocher les articles restants, sans cochage automatique : les articles pas encore cochés le restent, et le besoin ne passe pas automatiquement en « Fait ». Cocher le dernier article (toujours à la main) ferme le besoin ; décocher un article après coup le rouvre (« Pris en charge » ou « Ouvert » selon le cas). Depuis le 28/08/2026 (PR #317), la création d'une liste de courses passe par une popup dédiée « 🛒 Créer une liste de courses » (au lieu du formulaire intégré) ; un catalogue « 🔁 Produits récurrents », propre à chaque espace, se construit automatiquement à partir de chaque article déjà saisi (dans une nouvelle liste comme dans une liste déjà publiée) et permet d'ajouter un article d'un seul tap sans le retaper — l'admin peut le nettoyer par appui long et sélection multiple, sans effet sur les listes déjà publiées. Depuis le 28/08/2026 (PR #318), la croix de suppression rapide d'un article d'une liste déjà publiée (« 👁️ Aperçu de la liste ») est réservée à l'auteur du besoin ou à l'admin — un autre visiteur peut toujours cocher/décocher les articles mais ne peut plus en supprimer directement. Depuis le 28/08/2026 (PR #320), le bouton « Je m'en occupe » disparaît du besoin dès qu'une personne a coché au moins un article (même liste incomplète), pour éviter un double claim en cours de cochage collaboratif ; dans le popup « 🔁 Produits récurrents », un article déjà présent dans la liste en cours se surligne directement dans le catalogue au lieu d'un simple toast « Déjà dans la liste ». Depuis le 01/09/2026 (PR #352), une fois qu'une prise en charge formelle (« Je m'en occupe ») existe sur le besoin, la mention « … partiellement » disparaît du badge de statut — elle ne s'affiche plus que pendant la phase de dispatch spontané, avant toute prise en charge, pour éviter une contradiction avec le badge « Pris en charge ». Depuis le 12/09/2026 (PR #432), le mur affiche aussi une rangée d'avatars groupés (une vignette par contributeur distinct, photo ou initiales) juste avant la phrase « X et Y s'en occupent », remplaçant le pictogramme générique « 👤 » utilisé jusque-là pour cette catégorie.</w:t>
+            </w:r>
+            <w:r>
+              <w:rPr>
+                <w:rFonts w:ascii="Arial" w:hAnsi="Arial"/>
+                <w:b w:val="0"/>
+                <w:i w:val="0"/>
+                <w:sz w:val="18"/>
+              </w:rPr>
+              <w:t xml:space="preserve"> Depuis le 12/09/2026 (PR #436), cliquer « Je m'en occupe » sur une liste de courses coche à nouveau automatiquement les articles restants et les attribue au preneur (comportement retiré en v1.10, voir « Cycle de vie d'un besoin » ci-dessus, réintroduit ce cycle à la demande explicite de l'utilisateur en complément du bouton « ✓ Fait » ci-dessous) ; ajouter un article à une liste déjà marquée « Fait » repasse désormais toujours le besoin en « ouvert » et efface la prise en charge (au lieu de revenir en « pris_en_charge » selon les cas, PR #437), pour qu'un nouvel article reste cochable par n'importe qui et que « Je m'en occupe » réapparaisse. Depuis le 12/09/2026 (PR #437) : chaque personne ayant coché au moins un article d'une liste dont l'échéance tombe le jour même reçoit elle aussi le popup de rappel d'échéance (voir « Cycle de vie d'un besoin » ci-dessus) avec la liste de ses propres articles, bouton ouvrant directement « 👁️ Aperçu de la liste » ; la mention « … partiellement » persiste désormais aussi une fois le besoin auto-fermé (statut « fermé »), pas seulement « ouvert » ; l'aperçu de la liste (ShoppingListModal) se resynchronise en direct avec le besoin affiché (écritures du modal lui-même ou d'un autre visiteur reflétées sans fermer/rouvrir le popup) et regroupe désormais les articles par personne qui s'en occupe (une seule photo/avatar par personne, ordre alphabétique dans chaque groupe, groupe de l'utilisateur courant en premier). Depuis le 13/09/2026 (PR #438) : un bouton « ✓ Fait » (mur d'Entraide et popup de rappel d'échéance) permet à toute personne ayant coché au moins un article — ou à la preneuse/preneur formel — de cocher directement tout le reste de la liste à son nom et de refermer le besoin, y compris sur un besoin déjà fermé/en Historique, pour débloquer une liste restée bloquée par une prise en charge sans cochage automatique (cas réel rencontré : une prise en charge posée avant la réintroduction du cochage automatique de PR #436 n'avait jamais refermé le besoin) ; le bouton « Je m'en occupe » reste par ailleurs visible sur un besoin « Pris en charge » dont la liste n'est pas encore intégralement cochée — dans ce cas, une phrase d'avertissement rouge « ⚠️ Certains articles ne sont pas encore pris en charge » s'affiche sur le bloc du besoin et le badge de statut devient « Pris en charge / partiellement » (sur 2 lignes).</w:t>
             </w:r>
           </w:p>
         </w:tc>
@@ -13159,6 +13177,12 @@
                 <w:b w:val="0"/>
               </w:rPr>
               <w:t>Tuile listant les besoins d'Entraide sur lesquels la personne connectée est engagée (ouverts, pris en charge, ou fermés si pertinents cette semaine), avec un bloc dédié pour les listes de courses (avatars des contributeurs, cases déjà cochées). Depuis le 10/09/2026 (PR #426-427), chaque carte de besoin (hors relais) affiche « Besoin {catégorie} pour le [jour] JJ/MM/AAAA », « Publié par [prénom nom] » puis le statut ; un besoin de relais affiche « Publié par [auteur] », « Pris en charge » ou « Pris en charge partiellement », puis la barre de progression jour par jour (voir ci-dessous) bornée à la semaine en cours. Tri chronologique par date de début pour les relais (PR #427). Chaque entrée renvoie vers le besoin correspondant dans le mur d'Entraide, focusTaskId à l'appui (PR #425). Le bloc « 🔔 Mes alertes », présent dans une première version de cette tuile, en a été retiré (PR #425). Depuis le 12/09/2026 (PR #431), cette tuile est resserrée aux besoins où la personne connectée est réellement engagée : un besoin simplement publié par elle sans qu'elle le prenne elle-même en charge n'y apparaît plus (reste visible dans « Mes besoins », Mon Compte) ; chaque carte de besoin hors relais/courses (repas, affaires, administratif, autre, transport) affiche désormais aussi la photo (ou l'avatar aux initiales prénom + nom) de la personne en charge, relais et courses disposant déjà chacun de leur propre affichage d'avatar.</w:t>
+            </w:r>
+            <w:r>
+              <w:rPr>
+                <w:b w:val="0"/>
+              </w:rPr>
+              <w:t xml:space="preserve"> Correctif du 12/09/2026 (PR #435) : la tuile affichait un besoin engagé quelle que soit sa semaine d'échéance au lieu de le filtrer sur la semaine actuellement affichée — désormais filtrée correctement à la semaine en cours.</w:t>
             </w:r>
           </w:p>
         </w:tc>

</xml_diff>

<commit_message>
docs: handoff PR #440-450 (courses attribution/achat, popup édition, alerte désengagement J-2, avatars/bulles WhatsApp)
Documentation Fonctionnalités.docx V1.36→V1.37, PRD_AvecToi_v1_4.md v1.35→v1.36,
handoff.md réécrit pour le cycle PR #440-450 (11 PR) :
- Courses : attribution (cocher) et achat réel (« Fait ») décorrélés (#440-444)
- Popup « Modifier le besoin » simplifié en édition (#445)
- Alerte de désengagement tardif J-2, nouvelle table task_disengage_alerts (#446-448)
- Avatars photo-ou-initiales + bulles à largeur fixe façon WhatsApp, corrigées en
  cours de cycle après retour utilisateur ; boutons C'est fait/Se désinscrire
  étendus aux besoins génériques pris en charge (#449-450)

Co-Authored-By: Claude Sonnet 5 <noreply@anthropic.com>
Claude-Session: https://claude.ai/code/session_01E5eMfnsVmAhe7Rz4TFNVm1
</commit_message>
<xml_diff>
--- a/Documentation/Documentation Fonctionnalités.docx
+++ b/Documentation/Documentation Fonctionnalités.docx
@@ -280,7 +280,7 @@
                 <w:color w:val="A0C4E8"/>
                 <w:sz w:val="17"/>
               </w:rPr>
-              <w:t>13/09/2026 — V1.36</w:t>
+              <w:t>14/09/2026 — V1.37</w:t>
             </w:r>
           </w:p>
         </w:tc>
@@ -7050,7 +7050,7 @@
                 <w:i w:val="0"/>
                 <w:sz w:val="18"/>
               </w:rPr>
-              <w:t xml:space="preserve"> Depuis le 31/08/2026 (PR #350), un appui long sur une photo du fil (hors vue Médias, déjà équipée d'un bouton de téléchargement dédié) la télécharge directement, comme c'était déjà le cas sur le Mur de soutien.</w:t>
+              <w:t xml:space="preserve"> Depuis le 31/08/2026 (PR #350), un appui long sur une photo du fil (hors vue Médias, déjà équipée d'un bouton de téléchargement dédié) la télécharge directement, comme c'était déjà le cas sur le Mur de soutien. Depuis le 13-14/09/2026 (PR #449, corrigé #450), l'auteur de chaque nouvelle est identifié par sa vraie photo de profil (ou, à défaut, un avatar aux initiales prénom + nom) au lieu d'une simple initiale ; les cartes reprennent une disposition façon WhatsApp (mes publications à droite, celles des autres à gauche), avec un retrait fixe d'1/5 de la largeur d'écran depuis le bord opposé sur toutes les cartes du côté concerné, au lieu de se réduire à la largeur de leur contenu.</w:t>
             </w:r>
           </w:p>
         </w:tc>
@@ -8162,7 +8162,7 @@
                 <w:i w:val="0"/>
                 <w:sz w:val="18"/>
               </w:rPr>
-              <w:t xml:space="preserve"> Depuis le 12/09/2026 (PR #435), un popup de rappel s'affiche à la connexion (et à chaque retour au premier plan) pour chaque besoin Repas/Affaires/Administratif/Autre pris en charge par l'utilisateur connecté dont l'échéance tombe le jour même — bouton « C'est fait » ouvrant directement la sheet de confirmation existante (PIN + photo optionnelle) via le même mécanisme que l'alerte de relais, bouton « Fermer » passant à l'alerte suivante ou ramenant vers « Ma semaine » ; le popup revient à chaque reconnexion tant que le besoin n'est pas marqué fait (texte affiné PR #436 puis simplifié PR #437, titre seul). Depuis le 12/09/2026 (PR #436), le bouton « ✏️ Modifier le besoin » (et son raccourci par appui long) est désormais visible pour l'auteur de n'importe quel besoin, visiteur inclus, et pas seulement l'admin sur ses propres besoins — permet de corriger une échéance oubliée à la publication directement depuis le mur.</w:t>
+              <w:t xml:space="preserve"> Depuis le 12/09/2026 (PR #435), un popup de rappel s'affiche à la connexion (et à chaque retour au premier plan) pour chaque besoin Repas/Affaires/Administratif/Autre pris en charge par l'utilisateur connecté dont l'échéance tombe le jour même — bouton « C'est fait » ouvrant directement la sheet de confirmation existante (PIN + photo optionnelle) via le même mécanisme que l'alerte de relais, bouton « Fermer » passant à l'alerte suivante ou ramenant vers « Ma semaine » ; le popup revient à chaque reconnexion tant que le besoin n'est pas marqué fait (texte affiné PR #436 puis simplifié PR #437, titre seul). Depuis le 12/09/2026 (PR #436), le bouton « ✏️ Modifier le besoin » (et son raccourci par appui long) est désormais visible pour l'auteur de n'importe quel besoin, visiteur inclus, et pas seulement l'admin sur ses propres besoins — permet de corriger une échéance oubliée à la publication directement depuis le mur. Depuis le 13/09/2026 (PR #445), en édition d'un besoin déjà publié, la catégorie et le libellé « Relais » ne sont plus modifiables (grille masquée), le libellé « Photo (optionnelle) » est retiré du bouton photo (création et édition), le toggle Urgent passe à un texte simple, et « Me désengager » redevient réservé à la personne ayant réellement pris en charge le besoin ; le crayon d'édition (et son raccourci par appui long) disparaît une fois l'échéance du besoin dépassée. Depuis le 13/09/2026 (PR #449), l'auteur du besoin est identifié sur la ligne « 🗓️ Publié le » par sa vraie photo de profil (ou un avatar aux initiales prénom + nom). Depuis le 14/09/2026 (PR #450), un besoin Repas/Affaires/Administratif/Autre pris en charge via « Je m'en occupe » propose aussi, à la personne qui l'a pris en charge, les boutons « ✓ C'est fait » et « Se désinscrire », jusque-là réservés à Courses/Transport/Relais — l'admin n'est donc plus seul à pouvoir le clore via « Marquer fait ».</w:t>
             </w:r>
           </w:p>
         </w:tc>
@@ -8325,7 +8325,7 @@
                 <w:i w:val="0"/>
                 <w:sz w:val="18"/>
               </w:rPr>
-              <w:t xml:space="preserve"> Depuis le 12/09/2026 (PR #436), cliquer « Je m'en occupe » sur une liste de courses coche à nouveau automatiquement les articles restants et les attribue au preneur (comportement retiré en v1.10, voir « Cycle de vie d'un besoin » ci-dessus, réintroduit ce cycle à la demande explicite de l'utilisateur en complément du bouton « ✓ Fait » ci-dessous) ; ajouter un article à une liste déjà marquée « Fait » repasse désormais toujours le besoin en « ouvert » et efface la prise en charge (au lieu de revenir en « pris_en_charge » selon les cas, PR #437), pour qu'un nouvel article reste cochable par n'importe qui et que « Je m'en occupe » réapparaisse. Depuis le 12/09/2026 (PR #437) : chaque personne ayant coché au moins un article d'une liste dont l'échéance tombe le jour même reçoit elle aussi le popup de rappel d'échéance (voir « Cycle de vie d'un besoin » ci-dessus) avec la liste de ses propres articles, bouton ouvrant directement « 👁️ Aperçu de la liste » ; la mention « … partiellement » persiste désormais aussi une fois le besoin auto-fermé (statut « fermé »), pas seulement « ouvert » ; l'aperçu de la liste (ShoppingListModal) se resynchronise en direct avec le besoin affiché (écritures du modal lui-même ou d'un autre visiteur reflétées sans fermer/rouvrir le popup) et regroupe désormais les articles par personne qui s'en occupe (une seule photo/avatar par personne, ordre alphabétique dans chaque groupe, groupe de l'utilisateur courant en premier). Depuis le 13/09/2026 (PR #438) : un bouton « ✓ Fait » (mur d'Entraide et popup de rappel d'échéance) permet à toute personne ayant coché au moins un article — ou à la preneuse/preneur formel — de cocher directement tout le reste de la liste à son nom et de refermer le besoin, y compris sur un besoin déjà fermé/en Historique, pour débloquer une liste restée bloquée par une prise en charge sans cochage automatique (cas réel rencontré : une prise en charge posée avant la réintroduction du cochage automatique de PR #436 n'avait jamais refermé le besoin) ; le bouton « Je m'en occupe » reste par ailleurs visible sur un besoin « Pris en charge » dont la liste n'est pas encore intégralement cochée — dans ce cas, une phrase d'avertissement rouge « ⚠️ Certains articles ne sont pas encore pris en charge » s'affiche sur le bloc du besoin et le badge de statut devient « Pris en charge / partiellement » (sur 2 lignes).</w:t>
+              <w:t xml:space="preserve"> Depuis le 12/09/2026 (PR #436), cliquer « Je m'en occupe » sur une liste de courses coche à nouveau automatiquement les articles restants et les attribue au preneur (comportement retiré en v1.10, voir « Cycle de vie d'un besoin » ci-dessus, réintroduit ce cycle à la demande explicite de l'utilisateur en complément du bouton « ✓ Fait » ci-dessous) ; ajouter un article à une liste déjà marquée « Fait » repasse désormais toujours le besoin en « ouvert » et efface la prise en charge (au lieu de revenir en « pris_en_charge » selon les cas, PR #437), pour qu'un nouvel article reste cochable par n'importe qui et que « Je m'en occupe » réapparaisse. Depuis le 12/09/2026 (PR #437) : chaque personne ayant coché au moins un article d'une liste dont l'échéance tombe le jour même reçoit elle aussi le popup de rappel d'échéance (voir « Cycle de vie d'un besoin » ci-dessus) avec la liste de ses propres articles, bouton ouvrant directement « 👁️ Aperçu de la liste » ; la mention « … partiellement » persiste désormais aussi une fois le besoin auto-fermé (statut « fermé »), pas seulement « ouvert » ; l'aperçu de la liste (ShoppingListModal) se resynchronise en direct avec le besoin affiché (écritures du modal lui-même ou d'un autre visiteur reflétées sans fermer/rouvrir le popup) et regroupe désormais les articles par personne qui s'en occupe (une seule photo/avatar par personne, ordre alphabétique dans chaque groupe, groupe de l'utilisateur courant en premier). Depuis le 13/09/2026 (PR #438) : un bouton « ✓ Fait » (mur d'Entraide et popup de rappel d'échéance) permet à toute personne ayant coché au moins un article — ou à la preneuse/preneur formel — de cocher directement tout le reste de la liste à son nom et de refermer le besoin, y compris sur un besoin déjà fermé/en Historique, pour débloquer une liste restée bloquée par une prise en charge sans cochage automatique (cas réel rencontré : une prise en charge posée avant la réintroduction du cochage automatique de PR #436 n'avait jamais refermé le besoin) ; le bouton « Je m'en occupe » reste par ailleurs visible sur un besoin « Pris en charge » dont la liste n'est pas encore intégralement cochée — dans ce cas, une phrase d'avertissement rouge « ⚠️ Certains articles ne sont pas encore pris en charge » s'affiche sur le bloc du besoin et le badge de statut devient « Pris en charge / partiellement » (sur 2 lignes). Depuis le 13/09/2026 (PR #440, affiné #442-444), cocher un article n'implique plus qu'il a été réellement acheté : l'identité de qui a coché (bought_by_prenom/nom/at) et le fait qu'il ait été acheté (bought, distinct) sont désormais décorrélés, ce dernier n'étant posé que par une action « Fait » — corrige un badge « Pris en charge » affiché à tort dès qu'un article était simplement coché ; « Se désinscrire » libère aussi les articles cochés-mais-non-achetés par la personne qui se désinscrit ; le filet de rattrapage historique qui laissait un seul clic « C'est fait » absorber des articles jamais cochés par personne a été retiré.</w:t>
             </w:r>
           </w:p>
         </w:tc>
@@ -8639,7 +8639,7 @@
                 <w:color w:val="1A1A1A"/>
                 <w:sz w:val="18"/>
               </w:rPr>
-              <w:t>Modal « 💛 Laisser un message », texte et photo optionnelle, sans PIN pour l'admin.</w:t>
+              <w:t>Modal « 💛 Laisser un message », texte et photo optionnelle, sans PIN pour l'admin. Depuis le 13-14/09/2026 (PR #449, corrigé #450), chaque message affiche la vraie photo de profil de son auteur (ou, à défaut, un avatar aux initiales prénom + nom, fond inchangé) à la place d'un rond générique ; les bulles reprennent une disposition façon WhatsApp (mes messages à droite, ceux des autres à gauche), avec un retrait fixe d'1/5 de la largeur d'écran depuis le bord opposé sur toutes les bulles du côté concerné, au lieu de se réduire à la largeur de leur contenu.</w:t>
             </w:r>
           </w:p>
         </w:tc>
@@ -9056,7 +9056,7 @@
                 <w:color w:val="1A1A1A"/>
                 <w:sz w:val="18"/>
               </w:rPr>
-              <w:t xml:space="preserve"> Depuis le 08/09/2026 (PR #403), une proposition de période sur un besoin de relais affiche aussi, dans le détail de l'alerte, les propositions déjà faites par d'autres personnes ciblées et leur statut de validation par l'admin.</w:t>
+              <w:t xml:space="preserve"> Depuis le 08/09/2026 (PR #403), une proposition de période sur un besoin de relais affiche aussi, dans le détail de l'alerte, les propositions déjà faites par d'autres personnes ciblées et leur statut de validation par l'admin. Depuis le 13/09/2026 (PR #446), une nouvelle section dédiée « 🔓 Désengagements » y liste, pour l'admin comme pour l'auteur du besoin concerné, tout désengagement (« Se désinscrire ») survenu à J-2 ou moins de l'échéance d'un besoin — nouvelle table task_disengage_alerts, alimentée par lib/taskDisengageAlerts.ts.</w:t>
             </w:r>
           </w:p>
         </w:tc>

</xml_diff>

<commit_message>
docs: handoff Besoin récurrent (PR #452-456)
Documente le mur d'Entraide : réglage récurrence à la création
(Hebdomadaire/Quinzaine/Tous les X jours), date obligatoire, libellé
2 lignes, bouton date de fin, suppression en cascade, et prise en
charge groupée d'une série via le switch Cette date/Toute la série.

Documentation Fonctionnalités.docx V1.37 → V1.38, PRD v1.36 → v1.37.

Co-Authored-By: Claude Sonnet 5 <noreply@anthropic.com>
Claude-Session: https://claude.ai/code/session_01E5eMfnsVmAhe7Rz4TFNVm1
</commit_message>
<xml_diff>
--- a/Documentation/Documentation Fonctionnalités.docx
+++ b/Documentation/Documentation Fonctionnalités.docx
@@ -7991,6 +7991,14 @@
               </w:rPr>
               <w:t xml:space="preserve"> Depuis le 30/08/2026 (PR #334), le champ « 🗺️ Lien Google Maps » de l'étape Départ/Arrivée ne se génère (ni ne se régénère) plus tant que rue, code postal et ville n'ont pas tous été saisis, pour éviter un lien prématuré et incomplet.</w:t>
             </w:r>
+            <w:r>
+              <w:rPr>
+                <w:rFonts w:ascii="Arial" w:hAnsi="Arial"/>
+                <w:b w:val="0"/>
+                <w:sz w:val="18"/>
+              </w:rPr>
+              <w:t xml:space="preserve"> Depuis le 14/09/2026 (PR #453), l'écran « Autres options » propose aussi un réglage « 🔁 Besoin récurrent » (Hebdomadaire / Quinzaine / Tous les X jours, avec date de fin et aperçu du nombre de besoins générés, plafonné à 52) : à la validation, toute la série est créée en un seul lot partageant un identifiant commun (recurrence_group_id), avec le même bandeau d'annulation 8s que la création groupée de checklist — disponible pour Repas/Affaires/Administratif/Autre/Courses (avec réplication de la liste d'articles pour chaque occurrence), Transport et Relais restant hors scope. Depuis le 14/09/2026 (PR #454), le champ date devient obligatoire dès l'écran de catégorie (Repas/Affaires/Administratif/Autre et Courses, bouton « 📅 Ajouter une date ») plutôt que facultatif en « Autres options », ce qui permet d'accéder directement au réglage de récurrence sans étape de blocage intermédiaire ; le popup de récurrence rappelle la date de début choisie et son calendrier de fin surligne en orange la date d'ancrage et toutes les occurrences prévues selon la sélection en cours. Depuis le 14/09/2026 (PR #455), le bouton de récurrence affiche sur 2 lignes le type choisi puis la période réelle avec le jour de la semaine (« Du [jour] DD/MM/YYYY au DD/MM/YYYY (x besoins) ») ; un bouton dédié à la date de fin apparaît directement dans les écrans Repas et Courses une fois la récurrence réglée, ramenant sur le calendrier de fin pour la modifier ; supprimer un besoin issu d'une série récurrente propose désormais de supprimer aussi les autres occurrences de la même série (même mécanisme que pour les checklists groupées).</w:t>
+            </w:r>
           </w:p>
         </w:tc>
       </w:tr>
@@ -8163,6 +8171,14 @@
                 <w:sz w:val="18"/>
               </w:rPr>
               <w:t xml:space="preserve"> Depuis le 12/09/2026 (PR #435), un popup de rappel s'affiche à la connexion (et à chaque retour au premier plan) pour chaque besoin Repas/Affaires/Administratif/Autre pris en charge par l'utilisateur connecté dont l'échéance tombe le jour même — bouton « C'est fait » ouvrant directement la sheet de confirmation existante (PIN + photo optionnelle) via le même mécanisme que l'alerte de relais, bouton « Fermer » passant à l'alerte suivante ou ramenant vers « Ma semaine » ; le popup revient à chaque reconnexion tant que le besoin n'est pas marqué fait (texte affiné PR #436 puis simplifié PR #437, titre seul). Depuis le 12/09/2026 (PR #436), le bouton « ✏️ Modifier le besoin » (et son raccourci par appui long) est désormais visible pour l'auteur de n'importe quel besoin, visiteur inclus, et pas seulement l'admin sur ses propres besoins — permet de corriger une échéance oubliée à la publication directement depuis le mur. Depuis le 13/09/2026 (PR #445), en édition d'un besoin déjà publié, la catégorie et le libellé « Relais » ne sont plus modifiables (grille masquée), le libellé « Photo (optionnelle) » est retiré du bouton photo (création et édition), le toggle Urgent passe à un texte simple, et « Me désengager » redevient réservé à la personne ayant réellement pris en charge le besoin ; le crayon d'édition (et son raccourci par appui long) disparaît une fois l'échéance du besoin dépassée. Depuis le 13/09/2026 (PR #449), l'auteur du besoin est identifié sur la ligne « 🗓️ Publié le » par sa vraie photo de profil (ou un avatar aux initiales prénom + nom). Depuis le 14/09/2026 (PR #450), un besoin Repas/Affaires/Administratif/Autre pris en charge via « Je m'en occupe » propose aussi, à la personne qui l'a pris en charge, les boutons « ✓ C'est fait » et « Se désinscrire », jusque-là réservés à Courses/Transport/Relais — l'admin n'est donc plus seul à pouvoir le clore via « Marquer fait ».</w:t>
+            </w:r>
+            <w:r>
+              <w:rPr>
+                <w:rFonts w:ascii="Arial" w:hAnsi="Arial"/>
+                <w:b w:val="0"/>
+                <w:sz w:val="18"/>
+              </w:rPr>
+              <w:t xml:space="preserve"> Depuis le 14/09/2026 (PR #456), le popup « Je m'en occupe » (formulaire prénom/nom/photo/précision) est désormais centré au milieu de l'écran comme les autres popups liés, au lieu de glisser depuis le bas ; sur un besoin issu d'une série récurrente encore ouverte sur d'autres dates, un switch « Cette date / Toute la série » y apparaît — activé, la prise en charge (identité, photo, précision, et pour Courses l'attribution des articles) s'applique en un seul geste à toutes les occurrences encore ouvertes de la série, le popup de remerciement indiquant alors combien d'autres dates ont été prises en charge en même temps.</w:t>
             </w:r>
           </w:p>
         </w:tc>

</xml_diff>

<commit_message>
docs: handoff C'est fait / doublons courses / suppression co-admin (PR #458)
Documentation Fonctionnalités.docx V1.37 -> V1.38, PRD_AvecToi_v1_4.md
v1.37 -> v1.38, Handoff/handoff.md réécrit — couvre PR #458 (navigation
post-"C'est fait" Courses, anti-doublon + autocomplétion du catalogue
Produits récurrents, suppression par appui long admin/co-admin).

Co-Authored-By: Claude Sonnet 5 <noreply@anthropic.com>
Claude-Session: https://claude.ai/code/session_01E5eMfnsVmAhe7Rz4TFNVm1
</commit_message>
<xml_diff>
--- a/Documentation/Documentation Fonctionnalités.docx
+++ b/Documentation/Documentation Fonctionnalités.docx
@@ -280,7 +280,7 @@
                 <w:color w:val="A0C4E8"/>
                 <w:sz w:val="17"/>
               </w:rPr>
-              <w:t>14/09/2026 — V1.37</w:t>
+              <w:t>16/09/2026 — V1.38</w:t>
             </w:r>
           </w:p>
         </w:tc>
@@ -8180,6 +8180,14 @@
               </w:rPr>
               <w:t xml:space="preserve"> Depuis le 14/09/2026 (PR #456), le popup « Je m'en occupe » (formulaire prénom/nom/photo/précision) est désormais centré au milieu de l'écran comme les autres popups liés, au lieu de glisser depuis le bas ; sur un besoin issu d'une série récurrente encore ouverte sur d'autres dates, un switch « Cette date / Toute la série » y apparaît — activé, la prise en charge (identité, photo, précision, et pour Courses l'attribution des articles) s'applique en un seul geste à toutes les occurrences encore ouvertes de la série, le popup de remerciement indiquant alors combien d'autres dates ont été prises en charge en même temps.</w:t>
             </w:r>
+            <w:r>
+              <w:rPr>
+                <w:rFonts w:ascii="Arial" w:hAnsi="Arial"/>
+                <w:b w:val="0"/>
+                <w:sz w:val="18"/>
+              </w:rPr>
+              <w:t xml:space="preserve"> Depuis le 16/09/2026 (PR #458), le bouton secondaire « ✓ C'est fait » du popup de rappel d'échéance du jour (catégorie Courses) ramène désormais systématiquement sur le mur d'Entraide, focus sur le besoin concerné, comme le fait déjà le bouton principal pour les autres catégories — auparavant, il pouvait aussi enchaîner sur l'alerte suivante ou retomber sur « Ma semaine ».</w:t>
+            </w:r>
           </w:p>
         </w:tc>
       </w:tr>
@@ -8342,6 +8350,15 @@
                 <w:sz w:val="18"/>
               </w:rPr>
               <w:t xml:space="preserve"> Depuis le 12/09/2026 (PR #436), cliquer « Je m'en occupe » sur une liste de courses coche à nouveau automatiquement les articles restants et les attribue au preneur (comportement retiré en v1.10, voir « Cycle de vie d'un besoin » ci-dessus, réintroduit ce cycle à la demande explicite de l'utilisateur en complément du bouton « ✓ Fait » ci-dessous) ; ajouter un article à une liste déjà marquée « Fait » repasse désormais toujours le besoin en « ouvert » et efface la prise en charge (au lieu de revenir en « pris_en_charge » selon les cas, PR #437), pour qu'un nouvel article reste cochable par n'importe qui et que « Je m'en occupe » réapparaisse. Depuis le 12/09/2026 (PR #437) : chaque personne ayant coché au moins un article d'une liste dont l'échéance tombe le jour même reçoit elle aussi le popup de rappel d'échéance (voir « Cycle de vie d'un besoin » ci-dessus) avec la liste de ses propres articles, bouton ouvrant directement « 👁️ Aperçu de la liste » ; la mention « … partiellement » persiste désormais aussi une fois le besoin auto-fermé (statut « fermé »), pas seulement « ouvert » ; l'aperçu de la liste (ShoppingListModal) se resynchronise en direct avec le besoin affiché (écritures du modal lui-même ou d'un autre visiteur reflétées sans fermer/rouvrir le popup) et regroupe désormais les articles par personne qui s'en occupe (une seule photo/avatar par personne, ordre alphabétique dans chaque groupe, groupe de l'utilisateur courant en premier). Depuis le 13/09/2026 (PR #438) : un bouton « ✓ Fait » (mur d'Entraide et popup de rappel d'échéance) permet à toute personne ayant coché au moins un article — ou à la preneuse/preneur formel — de cocher directement tout le reste de la liste à son nom et de refermer le besoin, y compris sur un besoin déjà fermé/en Historique, pour débloquer une liste restée bloquée par une prise en charge sans cochage automatique (cas réel rencontré : une prise en charge posée avant la réintroduction du cochage automatique de PR #436 n'avait jamais refermé le besoin) ; le bouton « Je m'en occupe » reste par ailleurs visible sur un besoin « Pris en charge » dont la liste n'est pas encore intégralement cochée — dans ce cas, une phrase d'avertissement rouge « ⚠️ Certains articles ne sont pas encore pris en charge » s'affiche sur le bloc du besoin et le badge de statut devient « Pris en charge / partiellement » (sur 2 lignes). Depuis le 13/09/2026 (PR #440, affiné #442-444), cocher un article n'implique plus qu'il a été réellement acheté : l'identité de qui a coché (bought_by_prenom/nom/at) et le fait qu'il ait été acheté (bought, distinct) sont désormais décorrélés, ce dernier n'étant posé que par une action « Fait » — corrige un badge « Pris en charge » affiché à tort dès qu'un article était simplement coché ; « Se désinscrire » libère aussi les articles cochés-mais-non-achetés par la personne qui se désinscrit ; le filet de rattrapage historique qui laissait un seul clic « C'est fait » absorber des articles jamais cochés par personne a été retiré.</w:t>
+            </w:r>
+            <w:r>
+              <w:rPr>
+                <w:rFonts w:ascii="Arial" w:hAnsi="Arial"/>
+                <w:b w:val="0"/>
+                <w:i w:val="0"/>
+                <w:sz w:val="18"/>
+              </w:rPr>
+              <w:t xml:space="preserve"> Depuis le 16/09/2026 (PR #458), l'ajout d'un article détecte aussi les doublons proches du catalogue « Produits récurrents » (typo, majuscule/minuscule, singulier/pluriel, avec/sans icône, via une distance de Levenshtein sur un libellé nettoyé) : un libellé identique une fois nettoyé réutilise silencieusement l'orthographe déjà cataloguée, un libellé proche sans être identique ouvre un popup proposant de choisir entre l'article existant et l'ajout du nouveau libellé comme article distinct ; une autocomplétion suggère aussi en direct les articles du catalogue correspondant à la saisie en cours. Le mode sélection/suppression par appui long dans « 🔁 Produits récurrents », jusque-là présent uniquement dans l'ancien popup dédié, est désormais aussi disponible dans l'étape équivalente de l'assistant « Publier » — réservé à l'admin et aux co-administrateurs actifs.</w:t>
             </w:r>
           </w:p>
         </w:tc>

</xml_diff>

<commit_message>
docs: handoff couleur visiteur orange + historique Entraide repliable (PR #460)
Documentation Fonctionnalités.docx V1.38 -> V1.39, PRD_AvecToi_v1_4.md
v1.38 -> v1.39, Handoff/handoff.md réécrit — couvre PR #460 (couleur
fixe orange du logo pour soi sur la légende visiteurs du calendrier,
PATIENT_PALETTE élargie à 8 teintes, sous-bloc Historique d'Entraide
replié par défaut).

Co-Authored-By: Claude Sonnet 5 <noreply@anthropic.com>
Claude-Session: https://claude.ai/code/session_01E5eMfnsVmAhe7Rz4TFNVm1
</commit_message>
<xml_diff>
--- a/Documentation/Documentation Fonctionnalités.docx
+++ b/Documentation/Documentation Fonctionnalités.docx
@@ -280,7 +280,7 @@
                 <w:color w:val="A0C4E8"/>
                 <w:sz w:val="17"/>
               </w:rPr>
-              <w:t>16/09/2026 — V1.38</w:t>
+              <w:t>19/09/2026 — V1.39</w:t>
             </w:r>
           </w:p>
         </w:tc>
@@ -8186,7 +8186,7 @@
                 <w:b w:val="0"/>
                 <w:sz w:val="18"/>
               </w:rPr>
-              <w:t xml:space="preserve"> Depuis le 16/09/2026 (PR #458), le bouton secondaire « ✓ C'est fait » du popup de rappel d'échéance du jour (catégorie Courses) ramène désormais systématiquement sur le mur d'Entraide, focus sur le besoin concerné, comme le fait déjà le bouton principal pour les autres catégories — auparavant, il pouvait aussi enchaîner sur l'alerte suivante ou retomber sur « Ma semaine ».</w:t>
+              <w:t xml:space="preserve"> Depuis le 16/09/2026 (PR #458), le bouton secondaire « ✓ C'est fait » du popup de rappel d'échéance du jour (catégorie Courses) ramène désormais systématiquement sur le mur d'Entraide, focus sur le besoin concerné, comme le fait déjà le bouton principal pour les autres catégories — auparavant, il pouvait aussi enchaîner sur l'alerte suivante ou retomber sur « Ma semaine ». Depuis le 19/09/2026 (PR #460), le sous-bloc « Historique » (besoins fermés) du mur d'Entraide se replie par défaut derrière un bandeau affichant le nombre d'éléments, au lieu de s'afficher systématiquement déroulé — évite un défilement interminable sur un espace actif de longue date ; même principe côté site web (EntraideBoard.tsx).</w:t>
             </w:r>
           </w:p>
         </w:tc>
@@ -14665,7 +14665,7 @@
                 <w:color w:val="1A1A1A"/>
                 <w:sz w:val="18"/>
               </w:rPr>
-              <w:t>L'écran Calendrier (mode Visites) reprend le rendu du Planning intervenant : liseré de couleur par visiteur, légende filtrable, fond pastel Orange/Rouge sur les jours Partiel/Complet, point vert Dispo conservé sur les jours sans réservation.</w:t>
+              <w:t>L'écran Calendrier (mode Visites) reprend le rendu du Planning intervenant : liseré de couleur par visiteur, légende filtrable, fond pastel Orange/Rouge sur les jours Partiel/Complet, point vert Dispo conservé sur les jours sans réservation. Depuis le 19/09/2026 (PR #460), la personne qui consulte le calendrier voit toujours ses propres réservations dans la couleur fixe orange du logo (SELF_COLOR), au lieu d'une couleur pouvant varier selon l'ordre des visiteurs de l'espace ; palette étendue à 8 teintes pour les autres visiteurs, synchronisée avec le site web (lib/dashboard/colors.ts).</w:t>
             </w:r>
           </w:p>
         </w:tc>

</xml_diff>

<commit_message>
Handoff PR #462-465 : accès visiteur, bandeau Secteur, report d'échéance checklist
Documentation/Documentation Fonctionnalités.docx (V1.39 -> V1.40) et
PRD_AvecToi_v1_4.md (v1.39 -> v1.40) mis à jour pour couvrir :
- PR #462 : écran "Accès visiteur" à deux modes (code dossier / lien)
- PR #463 : Secteur hospitalier désynchronisé du complément d'adresse
  et affiché dans le bandeau d'en-tête (SpaceHeader)
- PR #464-465 : bouton de report d'échéance sur les items suivants
  d'une checklist (Entraide + Mon Compte), corrigé pour utiliser
  ConfirmModal au lieu d'Alert.alert natif

CLAUDE.md : convention "Alert.alert() natif interdit" renforcée pour
couvrir explicitement les popups purement informatifs à un seul
bouton, après avoir été manquée une fois en session malgré sa
présence écrite.

Handoff/handoff.md régénéré pour ce cycle.

Co-Authored-By: Claude Sonnet 5 <noreply@anthropic.com>
Claude-Session: https://claude.ai/code/session_01E5eMfnsVmAhe7Rz4TFNVm1
</commit_message>
<xml_diff>
--- a/Documentation/Documentation Fonctionnalités.docx
+++ b/Documentation/Documentation Fonctionnalités.docx
@@ -280,7 +280,7 @@
                 <w:color w:val="A0C4E8"/>
                 <w:sz w:val="17"/>
               </w:rPr>
-              <w:t>19/09/2026 — V1.39</w:t>
+              <w:t>19/09/2026 — V1.40</w:t>
             </w:r>
           </w:p>
         </w:tc>
@@ -8061,7 +8061,7 @@
               <w:jc w:val="left"/>
             </w:pPr>
             <w:r>
-              <w:t>Bandeau dédié « ✨ Checklists suggérées », donnant accès à 9 des 15 modèles de la bibliothèque (« Congé proche aidant » et « Répit aidant », trop personnels, ne sont proposés que dans Mon Compte → Checklist personnelle) — intégralité des items visibles pour l'admin, contre un sous-ensemble marqué partageable côté visiteur. Depuis le 09/09/2026 (PR #416-417), la carte « 🏠 Soin à domicile » ouvre un sous-menu de 5 situations (🧹 aide au ménage, 🍽️ portage des repas, 📞 télésurveillance, 🛏️ matériel médical, 📋 mise en place générale — contenu historique inchangé) au lieu de publier directement son contenu, avec la même présentation côté Mon Compte → Checklist personnelle ; certains items proposent aussi plusieurs liens officiels au lieu d'un seul (PR #418 — le rendu boucle désormais sur tous les liens, y compris pour un item déjà publié sur le mur, pas seulement pendant la sélection). Chaque item publié conserve sa vraie catégorie Entraide (Repas, Affaires, Courses, Transport, Administratif ou Autre selon le modèle, plus seulement Administratif) ; après la sélection des items, un assistant présente un à un échéance → urgence → précision libre avant publication, sans étape photo. Certains items affichent aussi des pièces à réunir, un lien officiel cliquable et un rappel de renouvellement mensuel. L'anti-doublon (par titre) s'applique désormais à toutes les catégories et tolère un besoin supprimé en douceur par l'admin (deleted_by_admin), qui ne bloque plus le ré-import du même item. Depuis le 21/08/2026 (PR #297), la publication d'une checklist suggérée permet de choisir la destination : Mur d'Entraide seul, « Mes Checklists » seul, ou les deux en même temps — dans ce dernier cas les deux copies restent liées et se synchronisent automatiquement (statut « Fait », identité de qui s'en occupe).</w:t>
+              <w:t>Bandeau dédié « ✨ Checklists suggérées », donnant accès à 9 des 15 modèles de la bibliothèque (« Congé proche aidant » et « Répit aidant », trop personnels, ne sont proposés que dans Mon Compte → Checklist personnelle) — intégralité des items visibles pour l'admin, contre un sous-ensemble marqué partageable côté visiteur. Depuis le 09/09/2026 (PR #416-417), la carte « 🏠 Soin à domicile » ouvre un sous-menu de 5 situations (🧹 aide au ménage, 🍽️ portage des repas, 📞 télésurveillance, 🛏️ matériel médical, 📋 mise en place générale — contenu historique inchangé) au lieu de publier directement son contenu, avec la même présentation côté Mon Compte → Checklist personnelle ; certains items proposent aussi plusieurs liens officiels au lieu d'un seul (PR #418 — le rendu boucle désormais sur tous les liens, y compris pour un item déjà publié sur le mur, pas seulement pendant la sélection). Chaque item publié conserve sa vraie catégorie Entraide (Repas, Affaires, Courses, Transport, Administratif ou Autre selon le modèle, plus seulement Administratif) ; après la sélection des items, un assistant présente un à un échéance → urgence → précision libre avant publication, sans étape photo. Depuis le 19/09/2026 (PR #464-465), un bouton « 📌 Reporter cette échéance sur les items suivants » sur chaque popup d'échéance permet d'appliquer la même date à tous les items restants du wizard en une seule action, plutôt que de la ressaisir item par item (popup de confirmation via ConfirmModal, jamais d'alerte système native). Certains items affichent aussi des pièces à réunir, un lien officiel cliquable et un rappel de renouvellement mensuel. L'anti-doublon (par titre) s'applique désormais à toutes les catégories et tolère un besoin supprimé en douceur par l'admin (deleted_by_admin), qui ne bloque plus le ré-import du même item. Depuis le 21/08/2026 (PR #297), la publication d'une checklist suggérée permet de choisir la destination : Mur d'Entraide seul, « Mes Checklists » seul, ou les deux en même temps — dans ce dernier cas les deux copies restent liées et se synchronisent automatiquement (statut « Fait », identité de qui s'en occupe).</w:t>
             </w:r>
             <w:r>
               <w:rPr>
@@ -9533,7 +9533,7 @@
               <w:jc w:val="left"/>
             </w:pPr>
             <w:r>
-              <w:t>Liste de tâches personnelle, distincte du Mur d'Entraide. Bouton « ✨ Checklists suggérées » donne accès aux 15 modèles de la bibliothèque, y compris « Congé proche aidant » et « Répit aidant », réservés à cet écran. Depuis le 09/09/2026 (PR #416-417), la carte « 🏠 Soin à domicile » ouvre ici aussi un sous-menu de 5 situations (aide au ménage, portage des repas, télésurveillance, matériel médical, mise en place générale) au lieu d'afficher directement ses items, alignée sur la présentation côté Entraide. Import via le même assistant séquentiel qu'Entraide (échéance → urgence → précision, sans étape photo) ; un switch « Publier aussi sur le Mur d'Entraide », désactivé par défaut, garde l'import privé sauf activation explicite. Les pièces à réunir d'un item importé apparaissent nichées et indentées sous leur item parent, cochables indépendamment ; le ou les liens officiels d'un item (plusieurs possibles depuis la PR #418) restent affichés et cliquables après import, pas seulement pendant la sélection. Certains items (8 modèles disponibles : demande à l'employeur, autorisation de soins pour un enfant, attestation d'autorité parentale, courrier à l'école/crèche, déclaration à la mutuelle/CPAM, procuration bancaire, absence pour hospitalisation d'un proche, déclaration de sinistre à l'assurance) affichent un bouton « ✉️ Préparer le courrier » ouvrant un popup de remplissage des champs obligatoires puis un aperçu fidèle au rendu final — destinataire, lieu/date et signature alignés à droite, comme sur un modèle de lettre administrative réel — avec rappel des pièces jointes à envoyer, avant enregistrement/téléchargement au format Word (.doc) sur l'appareil ou via le navigateur ; le partage direct par email pré-remplit l'objet du message. Chaque courrier généré est tracé dans un bouton « 📄 Mes documents » (juste sous « ✨ Checklists suggérées ») : un appui long sur une carte de ce bouton permet de la modifier (réouvre le formulaire pré-rempli, la nouvelle version remplace l'ancienne) ou de la supprimer, en plus du simple retéléchargement. Depuis le 21/08/2026 (PR #295), l'anti-doublon public (besoins déjà pris en charge sur le Mur) ne bloque un item que si l'import active « Publier aussi sur le Mur d'Entraide » ; en import purement privé, seuls les items déjà présents dans cette checklist privée sont bloqués — les deux listes restent indépendantes. Un appui long sur l'en-tête d'un groupe personnalisé ou importé propose sa suppression complète. Une liste de courses associée à un besoin catégorie Courses apparaît aussi dans « 📄 Mes documents » (préfixe 🛒), avec accès direct à la liste cochable. La suppression d'un ou plusieurs items publiés propose désormais, si d'autres items de la même checklist restent publiés et ouverts, de supprimer aussi le reste de la liste (PR #296). Depuis le 04/09/2026 (PR #377), le bouton « ✉️ Préparer le courrier » (Documents types) est réservé au Premium — reste visible en Freemium mais ouvre une popup « Fonctionnalité Premium » (ConfirmModal) au lieu du formulaire de courrier.</w:t>
+              <w:t>Liste de tâches personnelle, distincte du Mur d'Entraide. Bouton « ✨ Checklists suggérées » donne accès aux 15 modèles de la bibliothèque, y compris « Congé proche aidant » et « Répit aidant », réservés à cet écran. Depuis le 09/09/2026 (PR #416-417), la carte « 🏠 Soin à domicile » ouvre ici aussi un sous-menu de 5 situations (aide au ménage, portage des repas, télésurveillance, matériel médical, mise en place générale) au lieu d'afficher directement ses items, alignée sur la présentation côté Entraide. Import via le même assistant séquentiel qu'Entraide (échéance → urgence → précision, sans étape photo, avec le même bouton « 📌 Reporter cette échéance sur les items suivants » depuis le 19/09/2026 — PR #464-465, voir 5.9 Entraide) ; un switch « Publier aussi sur le Mur d'Entraide », désactivé par défaut, garde l'import privé sauf activation explicite. Les pièces à réunir d'un item importé apparaissent nichées et indentées sous leur item parent, cochables indépendamment ; le ou les liens officiels d'un item (plusieurs possibles depuis la PR #418) restent affichés et cliquables après import, pas seulement pendant la sélection. Certains items (8 modèles disponibles : demande à l'employeur, autorisation de soins pour un enfant, attestation d'autorité parentale, courrier à l'école/crèche, déclaration à la mutuelle/CPAM, procuration bancaire, absence pour hospitalisation d'un proche, déclaration de sinistre à l'assurance) affichent un bouton « ✉️ Préparer le courrier » ouvrant un popup de remplissage des champs obligatoires puis un aperçu fidèle au rendu final — destinataire, lieu/date et signature alignés à droite, comme sur un modèle de lettre administrative réel — avec rappel des pièces jointes à envoyer, avant enregistrement/téléchargement au format Word (.doc) sur l'appareil ou via le navigateur ; le partage direct par email pré-remplit l'objet du message. Chaque courrier généré est tracé dans un bouton « 📄 Mes documents » (juste sous « ✨ Checklists suggérées ») : un appui long sur une carte de ce bouton permet de la modifier (réouvre le formulaire pré-rempli, la nouvelle version remplace l'ancienne) ou de la supprimer, en plus du simple retéléchargement. Depuis le 21/08/2026 (PR #295), l'anti-doublon public (besoins déjà pris en charge sur le Mur) ne bloque un item que si l'import active « Publier aussi sur le Mur d'Entraide » ; en import purement privé, seuls les items déjà présents dans cette checklist privée sont bloqués — les deux listes restent indépendantes. Un appui long sur l'en-tête d'un groupe personnalisé ou importé propose sa suppression complète. Une liste de courses associée à un besoin catégorie Courses apparaît aussi dans « 📄 Mes documents » (préfixe 🛒), avec accès direct à la liste cochable. La suppression d'un ou plusieurs items publiés propose désormais, si d'autres items de la même checklist restent publiés et ouverts, de supprimer aussi le reste de la liste (PR #296). Depuis le 04/09/2026 (PR #377), le bouton « ✉️ Préparer le courrier » (Documents types) est réservé au Premium — reste visible en Freemium mais ouvre une popup « Fonctionnalité Premium » (ConfirmModal) au lieu du formulaire de courrier.</w:t>
             </w:r>
             <w:r>
               <w:rPr>
@@ -10316,7 +10316,7 @@
                 <w:color w:val="1A1A1A"/>
                 <w:sz w:val="18"/>
               </w:rPr>
-              <w:t>Service médical, secteur, chambre — affiché uniquement en mode hospitalier (masqué en soin à domicile).</w:t>
+              <w:t>Service médical, secteur, chambre — affiché uniquement en mode hospitalier (masqué en soin à domicile). Depuis le 19/09/2026 (PR #463), ces trois champs (précédés du nom de l'hôpital) sont aussi affichés dans le bandeau d'en-tête visible sur tous les écrans de l'espace.</w:t>
             </w:r>
           </w:p>
         </w:tc>
@@ -13589,7 +13589,7 @@
                 <w:color w:val="1A1A1A"/>
                 <w:sz w:val="18"/>
               </w:rPr>
-              <w:t>Écran « Accès visiteur » : collage du lien d'invitation ou ouverture directe via un lien profond (avectoi://invite?token=...).</w:t>
+              <w:t>Écran « Accès visiteur » à deux modes (bascule en haut) : code dossier à 7 caractères saisi directement, ou lien d'invitation — QR code ou copié —, préempli automatiquement si l'écran est ouvert via un deep-link (avectoi://invite?token=...). Depuis le 19/09/2026 (PR #462), remplace l'ancien écran limité au collage de lien ; parcours désormais identique à celui de l'intervenant.</w:t>
             </w:r>
           </w:p>
         </w:tc>

</xml_diff>

<commit_message>
docs: handoff rappel Transport + rôle auteur (PR #468-469)
Documentation Fonctionnalités.docx (V1.40 → V1.41) et PRD_AvecToi_v1_4.md
(v1.40 → v1.41) mis à jour : le popup de rappel d'échéance du jour couvre
désormais la catégorie Transport (PR #468) avec détails contextuels
(bénéficiaire, heures aller/retour) et un nouveau rôle « auteur » pour la
personne ayant publié ou bénéficiant du besoin sans le conduire elle-même
(PR #469) — même fonctionnement porté côté site web (avectoi-site PR #11-12).

Co-Authored-By: Claude Sonnet 5 <noreply@anthropic.com>
</commit_message>
<xml_diff>
--- a/Documentation/Documentation Fonctionnalités.docx
+++ b/Documentation/Documentation Fonctionnalités.docx
@@ -280,7 +280,7 @@
                 <w:color w:val="A0C4E8"/>
                 <w:sz w:val="17"/>
               </w:rPr>
-              <w:t>19/09/2026 — V1.40</w:t>
+              <w:t>21/09/2026 — V1.41</w:t>
             </w:r>
           </w:p>
         </w:tc>
@@ -8186,7 +8186,7 @@
                 <w:b w:val="0"/>
                 <w:sz w:val="18"/>
               </w:rPr>
-              <w:t xml:space="preserve"> Depuis le 16/09/2026 (PR #458), le bouton secondaire « ✓ C'est fait » du popup de rappel d'échéance du jour (catégorie Courses) ramène désormais systématiquement sur le mur d'Entraide, focus sur le besoin concerné, comme le fait déjà le bouton principal pour les autres catégories — auparavant, il pouvait aussi enchaîner sur l'alerte suivante ou retomber sur « Ma semaine ». Depuis le 19/09/2026 (PR #460), le sous-bloc « Historique » (besoins fermés) du mur d'Entraide se replie par défaut derrière un bandeau affichant le nombre d'éléments, au lieu de s'afficher systématiquement déroulé — évite un défilement interminable sur un espace actif de longue date ; même principe côté site web (EntraideBoard.tsx).</w:t>
+              <w:t xml:space="preserve"> Depuis le 16/09/2026 (PR #458), le bouton secondaire « ✓ C'est fait » du popup de rappel d'échéance du jour (catégorie Courses) ramène désormais systématiquement sur le mur d'Entraide, focus sur le besoin concerné, comme le fait déjà le bouton principal pour les autres catégories — auparavant, il pouvait aussi enchaîner sur l'alerte suivante ou retomber sur « Ma semaine ». Depuis le 19/09/2026 (PR #460), le sous-bloc « Historique » (besoins fermés) du mur d'Entraide se replie par défaut derrière un bandeau affichant le nombre d'éléments, au lieu de s'afficher systématiquement déroulé — évite un défilement interminable sur un espace actif de longue date ; même principe côté site web (EntraideBoard.tsx). Depuis le 21/09/2026 (PR #468), le popup de rappel d'échéance du jour (voir ci-dessus, PR #435) s'étend à la catégorie Transport : il s'affiche désormais aussi à la connexion pour la personne ayant pris en charge (« conductrice ») un trajet aller et/ou retour dont la date confirmée (transport_confirmed_date) tombe le jour même, en plus des catégories Repas/Affaires/Administratif/Autre déjà couvertes — bouton « ✓ C'est fait » ouvrant la sheet de confirmation PIN habituelle comme pour les autres catégories. Depuis le 21/09/2026 (PR #469), ce popup de rappel s'enrichit de précisions contextuelles selon la catégorie et le rôle de la personne connectée : pour un besoin Transport pris en charge (rôle « conductrice »), affichage du bénéficiaire du trajet, de l'heure aller et/ou retour selon la ou les jambes effectivement prises en charge, et d'une mention du trajet complémentaire si l'autre jambe (aller ou retour) est aussi prévue mais assurée par quelqu'un d'autre ; l'auteur d'un besoin Transport (ou la personne nommée comme bénéficiaire via « Pour une autre personne »), qui ne conduit pas elle-même, reçoit désormais aussi ce rappel le jour même (nouveau rôle « auteur », jamais cumulé avec le rôle « conductrice » sur un même besoin), listant qui assure l'aller et le retour et à quelle heure, ou « pas encore pris en charge » si personne ne s'est engagé — bouton principal renvoyant vers le besoin dans le mur sans tenter d'ouvrir la sheet de confirmation PIN (non pertinente pour un auteur qui n'est pas conducteur) ; les catégories Courses (liste d'articles) et Repas/Affaires/Administratif/Autre (description) affichaient déjà les précisions nécessaires, sans modification requise. Même fonctionnement porté côté site web (avectoi.care, PR #11-12).</w:t>
             </w:r>
           </w:p>
         </w:tc>

</xml_diff>